<commit_message>
fix: gestor normativo conversacional + regla 2000m² + IFC ejemplos reales
- /api/chat recibe historial (6 turnos): se puede indagar en seguimiento, no 1 sola pregunta
- Ley 400 actualizada: supervisión técnica obligatoria >2000 m² (inyectada en RAG y system prompt)
- IFC de ejemplo reemplazados por modelo real (4 muros+losa+4 columnas+viga) — antes 0 elementos
- Valor comercial producto $25M en plan de negocios + estudio financiero + DOCX regenerado
</commit_message>
<xml_diff>
--- a/docs/universidad/OBRahUB-Documentos-Universidad.docx
+++ b/docs/universidad/OBRahUB-Documentos-Universidad.docx
@@ -1596,7 +1596,7 @@
               <w:fldChar w:fldCharType="separate"/>
             </w:r>
             <w:r>
-              <w:t>15</w:t>
+              <w:t>16</w:t>
             </w:r>
             <w:r>
               <w:fldChar w:fldCharType="end"/>
@@ -7705,6 +7705,63 @@
                 <w:sz w:val="20"/>
                 <w:szCs w:val="20"/>
               </w:rPr>
+              <w:t xml:space="preserve">Valor comercial del producto</w:t>
+            </w:r>
+          </w:p>
+        </w:tc>
+        <w:tc>
+          <w:tcPr>
+            <w:tcW w:type="dxa" w:w="4500"/>
+            <w:tcMar>
+              <w:top w:type="dxa" w:w="60"/>
+              <w:left w:type="dxa" w:w="100"/>
+              <w:bottom w:type="dxa" w:w="60"/>
+              <w:right w:type="dxa" w:w="100"/>
+            </w:tcMar>
+          </w:tcPr>
+          <w:p>
+            <w:pPr>
+              <w:spacing w:line="276"/>
+            </w:pPr>
+            <w:r>
+              <w:rPr>
+                <w:b w:val="false"/>
+                <w:bCs w:val="false"/>
+                <w:color w:val="1A1A1A"/>
+                <w:sz w:val="20"/>
+                <w:szCs w:val="20"/>
+              </w:rPr>
+              <w:t xml:space="preserve">COP 25.000.000</w:t>
+            </w:r>
+          </w:p>
+        </w:tc>
+      </w:tr>
+      <w:tr>
+        <w:trPr>
+          <w:cantSplit/>
+        </w:trPr>
+        <w:tc>
+          <w:tcPr>
+            <w:tcW w:type="dxa" w:w="4500"/>
+            <w:tcMar>
+              <w:top w:type="dxa" w:w="60"/>
+              <w:left w:type="dxa" w:w="100"/>
+              <w:bottom w:type="dxa" w:w="60"/>
+              <w:right w:type="dxa" w:w="100"/>
+            </w:tcMar>
+          </w:tcPr>
+          <w:p>
+            <w:pPr>
+              <w:spacing w:line="276"/>
+            </w:pPr>
+            <w:r>
+              <w:rPr>
+                <w:b w:val="false"/>
+                <w:bCs w:val="false"/>
+                <w:color w:val="1A1A1A"/>
+                <w:sz w:val="20"/>
+                <w:szCs w:val="20"/>
+              </w:rPr>
               <w:t xml:space="preserve">Costos fijos mensuales (año 1)</w:t>
             </w:r>
           </w:p>
@@ -9403,6 +9460,35 @@
         </w:tc>
       </w:tr>
     </w:tbl>
+    <w:p>
+      <w:pPr>
+        <w:spacing w:after="120" w:line="312"/>
+        <w:jc w:val="both"/>
+      </w:pPr>
+      <w:r>
+        <w:rPr>
+          <w:sz w:val="22"/>
+          <w:szCs w:val="22"/>
+        </w:rPr>
+        <w:t xml:space="preserve">&gt; </w:t>
+      </w:r>
+      <w:r>
+        <w:rPr>
+          <w:b/>
+          <w:bCs/>
+          <w:sz w:val="22"/>
+          <w:szCs w:val="22"/>
+        </w:rPr>
+        <w:t xml:space="preserve">Valor comercial del producto (ObraHub): $25.000.000 COP</w:t>
+      </w:r>
+      <w:r>
+        <w:rPr>
+          <w:sz w:val="22"/>
+          <w:szCs w:val="22"/>
+        </w:rPr>
+        <w:t xml:space="preserve"> — valoración de realización a la fecha, superior a la inversión ejecutada ($18 M) por el valor agregado del activo intangible: plataforma en producción, base normativa colombiana verificada (18 normas de la cadena NSR-10), suite E2E y marca registrada en curso bajo Cratere S.A.S.</w:t>
+      </w:r>
+    </w:p>
     <w:p>
       <w:pPr>
         <w:pStyle w:val="Heading2"/>

</xml_diff>